<commit_message>
Met à jour la documentation pour installation avec PHP natif uniquement
</commit_message>
<xml_diff>
--- a/DOCUMENTATION_MY_SCHOOL.docx
+++ b/DOCUMENTATION_MY_SCHOOL.docx
@@ -77,7 +77,7 @@
         <w:pStyle w:val="ListBullet"/>
       </w:pPr>
       <w:r>
-        <w:t>4. Installation</w:t>
+        <w:t>4. Installation avec PHP natif</w:t>
       </w:r>
     </w:p>
     <w:p>
@@ -276,7 +276,7 @@
         <w:pStyle w:val="ListBullet"/>
       </w:pPr>
       <w:r>
-        <w:t>Serveur web Apache, Nginx ou serveur PHP intégré</w:t>
+        <w:t>Serveur web (Apache, Nginx) ou serveur PHP intégré</w:t>
       </w:r>
     </w:p>
     <w:p>
@@ -332,7 +332,7 @@
         <w:pStyle w:val="Heading1"/>
       </w:pPr>
       <w:r>
-        <w:t>4. Installation</w:t>
+        <w:t>4. Installation avec PHP natif</w:t>
       </w:r>
     </w:p>
     <w:p>
@@ -340,7 +340,7 @@
         <w:pStyle w:val="Heading2"/>
       </w:pPr>
       <w:r>
-        <w:t>4.1. Installation avec Laragon (recommandée)</w:t>
+        <w:t>4.1. Préparation</w:t>
       </w:r>
     </w:p>
     <w:p>
@@ -348,7 +348,7 @@
         <w:pStyle w:val="ListNumber"/>
       </w:pPr>
       <w:r>
-        <w:t>Installer Laragon (Version Full)</w:t>
+        <w:t>Installer PHP 8.5 depuis https://windows.php.net/download/ (version Thread Safe ou Non-Thread Safe selon votre serveur web)</w:t>
       </w:r>
     </w:p>
     <w:p>
@@ -356,7 +356,7 @@
         <w:pStyle w:val="ListNumber"/>
       </w:pPr>
       <w:r>
-        <w:t>Placer le dossier My_School dans C:\laragon\www\</w:t>
+        <w:t>Installer PostgreSQL 14+ depuis https://www.enterprisedb.com/downloads/postgres-postgresql-downloads</w:t>
       </w:r>
     </w:p>
     <w:p>
@@ -364,7 +364,7 @@
         <w:pStyle w:val="ListNumber"/>
       </w:pPr>
       <w:r>
-        <w:t>Démarrer Apache et PostgreSQL depuis Laragon</w:t>
+        <w:t>Installer et configurer Apache ou Nginx, ou utiliser le serveur PHP intégré</w:t>
       </w:r>
     </w:p>
     <w:p>
@@ -372,15 +372,15 @@
         <w:pStyle w:val="ListNumber"/>
       </w:pPr>
       <w:r>
-        <w:t>Ouvrir http://localhost/My_School/install.php</w:t>
+        <w:t>Vérifier que les extensions requises sont activées dans php.ini (pdo_pgsql, pgsql, gd, mbstring, openssl, curl, zip, fileinfo)</w:t>
       </w:r>
     </w:p>
     <w:p>
       <w:pPr>
-        <w:pStyle w:val="ListNumber"/>
+        <w:pStyle w:val="Heading2"/>
       </w:pPr>
       <w:r>
-        <w:t>Suivre l'assistant d'installation</w:t>
+        <w:t>4.2. Déploiement du projet</w:t>
       </w:r>
     </w:p>
     <w:p>
@@ -388,15 +388,15 @@
         <w:pStyle w:val="ListNumber"/>
       </w:pPr>
       <w:r>
-        <w:t>Supprimer install.php après installation réussie</w:t>
+        <w:t>Copier le dossier My_School dans le répertoire racine de votre serveur web (ex: C:\Apache24\htdocs\My_School\ ou tout autre répertoire)</w:t>
       </w:r>
     </w:p>
     <w:p>
       <w:pPr>
-        <w:pStyle w:val="Heading2"/>
+        <w:pStyle w:val="ListNumber"/>
       </w:pPr>
       <w:r>
-        <w:t>4.2. Installation avec XAMPP</w:t>
+        <w:t>Créer une base de données PostgreSQL nommée my_school</w:t>
       </w:r>
     </w:p>
     <w:p>
@@ -404,7 +404,7 @@
         <w:pStyle w:val="ListNumber"/>
       </w:pPr>
       <w:r>
-        <w:t>Installer XAMPP et PostgreSQL</w:t>
+        <w:t>Copier le fichier .env.example vers .env à la racine du projet</w:t>
       </w:r>
     </w:p>
     <w:p>
@@ -412,7 +412,7 @@
         <w:pStyle w:val="ListNumber"/>
       </w:pPr>
       <w:r>
-        <w:t>Placer le dossier dans C:\xampp\htdocs\My_School\</w:t>
+        <w:t>Configurer les identifiants PostgreSQL dans le fichier .env</w:t>
       </w:r>
     </w:p>
     <w:p>
@@ -420,7 +420,7 @@
         <w:pStyle w:val="ListNumber"/>
       </w:pPr>
       <w:r>
-        <w:t>Activer les extensions pdo_pgsql, pgsql, gd, mbstring dans php.ini</w:t>
+        <w:t>Générer une clé de chiffrement unique</w:t>
       </w:r>
     </w:p>
     <w:p>
@@ -428,7 +428,7 @@
         <w:pStyle w:val="ListNumber"/>
       </w:pPr>
       <w:r>
-        <w:t>Démarrer Apache et PostgreSQL</w:t>
+        <w:t>Lancer l'assistant d'installation via http://votre-domaine/My_School/install.php</w:t>
       </w:r>
     </w:p>
     <w:p>
@@ -436,7 +436,7 @@
         <w:pStyle w:val="ListNumber"/>
       </w:pPr>
       <w:r>
-        <w:t>Accéder à http://localhost/My_School/install.php et suivre l'assistant</w:t>
+        <w:t>Suivre les étapes de l'assistant</w:t>
       </w:r>
     </w:p>
     <w:p>
@@ -444,7 +444,7 @@
         <w:pStyle w:val="ListNumber"/>
       </w:pPr>
       <w:r>
-        <w:t>Supprimer install.php après installation</w:t>
+        <w:t>Supprimer le fichier install.php après une installation réussie</w:t>
       </w:r>
     </w:p>
     <w:p>
@@ -452,12 +452,121 @@
         <w:pStyle w:val="Heading2"/>
       </w:pPr>
       <w:r>
-        <w:t>4.3. Configuration manuelle</w:t>
+        <w:t>4.3. Configuration du fichier .env</w:t>
       </w:r>
     </w:p>
     <w:p>
       <w:r>
-        <w:t>Copier le fichier .env.example vers .env et configurer les paramètres de connexion à la base de données PostgreSQL ainsi que la clé de chiffrement.</w:t>
+        <w:t>Exemple de configuration :</w:t>
+      </w:r>
+    </w:p>
+    <w:p>
+      <w:pPr>
+        <w:pStyle w:val="IntenseQuote"/>
+      </w:pPr>
+      <w:r>
+        <w:t>DB_HOST=127.0.0.1</w:t>
+      </w:r>
+    </w:p>
+    <w:p>
+      <w:pPr>
+        <w:pStyle w:val="IntenseQuote"/>
+      </w:pPr>
+      <w:r>
+        <w:t>DB_PORT=5432</w:t>
+      </w:r>
+    </w:p>
+    <w:p>
+      <w:pPr>
+        <w:pStyle w:val="IntenseQuote"/>
+      </w:pPr>
+      <w:r>
+        <w:t>DB_NAME=my_school</w:t>
+      </w:r>
+    </w:p>
+    <w:p>
+      <w:pPr>
+        <w:pStyle w:val="IntenseQuote"/>
+      </w:pPr>
+      <w:r>
+        <w:t>DB_USER=postgres</w:t>
+      </w:r>
+    </w:p>
+    <w:p>
+      <w:pPr>
+        <w:pStyle w:val="IntenseQuote"/>
+      </w:pPr>
+      <w:r>
+        <w:t>DB_PASSWORD=VOTRE_MOT_DE_PASSE</w:t>
+      </w:r>
+    </w:p>
+    <w:p>
+      <w:pPr>
+        <w:pStyle w:val="IntenseQuote"/>
+      </w:pPr>
+      <w:r>
+        <w:t>ENCRYPTION_KEY=GENEREZ_UNE_CLE_UNIQUE</w:t>
+      </w:r>
+    </w:p>
+    <w:p>
+      <w:pPr>
+        <w:pStyle w:val="IntenseQuote"/>
+      </w:pPr>
+      <w:r>
+        <w:t>MAIL_ENABLED=false</w:t>
+      </w:r>
+    </w:p>
+    <w:p>
+      <w:pPr>
+        <w:pStyle w:val="IntenseQuote"/>
+      </w:pPr>
+      <w:r>
+        <w:t>DEMO_LINKS=false</w:t>
+      </w:r>
+    </w:p>
+    <w:p/>
+    <w:p>
+      <w:r>
+        <w:t>Générer une clé unique avec :</w:t>
+      </w:r>
+    </w:p>
+    <w:p>
+      <w:pPr>
+        <w:pStyle w:val="IntenseQuote"/>
+      </w:pPr>
+      <w:r>
+        <w:t>php -r "echo bin2hex(random_bytes(32));"</w:t>
+      </w:r>
+    </w:p>
+    <w:p>
+      <w:pPr>
+        <w:pStyle w:val="Heading2"/>
+      </w:pPr>
+      <w:r>
+        <w:t>4.4. Lancement avec le serveur PHP intégré</w:t>
+      </w:r>
+    </w:p>
+    <w:p>
+      <w:r>
+        <w:t>Depuis le dossier du projet :</w:t>
+      </w:r>
+    </w:p>
+    <w:p>
+      <w:pPr>
+        <w:pStyle w:val="IntenseQuote"/>
+      </w:pPr>
+      <w:r>
+        <w:t>php -S localhost:8080</w:t>
+      </w:r>
+    </w:p>
+    <w:p>
+      <w:r>
+        <w:t>Puis accéder à http://localhost:8080/install.php</w:t>
+      </w:r>
+    </w:p>
+    <w:p>
+      <w:r>
+        <w:br w:type="page"/>
       </w:r>
     </w:p>
     <w:p>
@@ -1529,6 +1638,19 @@
       </w:pPr>
       <w:r>
         <w:t>Vérifier le bon fonctionnement</w:t>
+      </w:r>
+    </w:p>
+    <w:p>
+      <w:pPr>
+        <w:pStyle w:val="Heading2"/>
+      </w:pPr>
+      <w:r>
+        <w:t>10.2. Mise à jour de sécurité PHP</w:t>
+      </w:r>
+    </w:p>
+    <w:p>
+      <w:r>
+        <w:t>Pour une installation PHP native sur Windows ou Linux, il faut mettre à jour directement le binaire PHP en téléchargeant la version corrigée depuis le site officiel et en remplaçant le dossier PHP existant après avoir arrêté les services web.</w:t>
       </w:r>
     </w:p>
     <w:p>

</xml_diff>